<commit_message>
Atualizacao do Levatamento de Requisitos
</commit_message>
<xml_diff>
--- a/documentos/3.1 Levantamento de Requisitos.docx
+++ b/documentos/3.1 Levantamento de Requisitos.docx
@@ -1,6 +1,6 @@
 
 <file path=word/document.xml><?xml version="1.0" encoding="utf-8"?>
-<w:document xmlns:wpc="http://schemas.microsoft.com/office/word/2010/wordprocessingCanvas" xmlns:cx="http://schemas.microsoft.com/office/drawing/2014/chartex" xmlns:cx1="http://schemas.microsoft.com/office/drawing/2015/9/8/chartex" xmlns:cx2="http://schemas.microsoft.com/office/drawing/2015/10/21/chartex" xmlns:cx3="http://schemas.microsoft.com/office/drawing/2016/5/9/chartex" xmlns:cx4="http://schemas.microsoft.com/office/drawing/2016/5/10/chartex" xmlns:cx5="http://schemas.microsoft.com/office/drawing/2016/5/11/chartex" xmlns:cx6="http://schemas.microsoft.com/office/drawing/2016/5/12/chartex" xmlns:cx7="http://schemas.microsoft.com/office/drawing/2016/5/13/chartex" xmlns:cx8="http://schemas.microsoft.com/office/drawing/2016/5/14/chartex" xmlns:mc="http://schemas.openxmlformats.org/markup-compatibility/2006" xmlns:aink="http://schemas.microsoft.com/office/drawing/2016/ink" xmlns:am3d="http://schemas.microsoft.com/office/drawing/2017/model3d" xmlns:o="urn:schemas-microsoft-com:office:office" xmlns:oel="http://schemas.microsoft.com/office/2019/extlst" xmlns:r="http://schemas.openxmlformats.org/officeDocument/2006/relationships" xmlns:m="http://schemas.openxmlformats.org/officeDocument/2006/math" xmlns:v="urn:schemas-microsoft-com:vml" xmlns:wp14="http://schemas.microsoft.com/office/word/2010/wordprocessingDrawing" xmlns:wp="http://schemas.openxmlformats.org/drawingml/2006/wordprocessingDrawing" xmlns:w10="urn:schemas-microsoft-com:office:word" xmlns:w="http://schemas.openxmlformats.org/wordprocessingml/2006/main" xmlns:w14="http://schemas.microsoft.com/office/word/2010/wordml" xmlns:w15="http://schemas.microsoft.com/office/word/2012/wordml" xmlns:w16cex="http://schemas.microsoft.com/office/word/2018/wordml/cex" xmlns:w16cid="http://schemas.microsoft.com/office/word/2016/wordml/cid" xmlns:w16="http://schemas.microsoft.com/office/word/2018/wordml" xmlns:w16du="http://schemas.microsoft.com/office/word/2023/wordml/word16du" xmlns:w16sdtdh="http://schemas.microsoft.com/office/word/2020/wordml/sdtdatahash" xmlns:w16sdtfl="http://schemas.microsoft.com/office/word/2024/wordml/sdtformatlock" xmlns:w16se="http://schemas.microsoft.com/office/word/2015/wordml/symex" xmlns:wpg="http://schemas.microsoft.com/office/word/2010/wordprocessingGroup" xmlns:wpi="http://schemas.microsoft.com/office/word/2010/wordprocessingInk" xmlns:wne="http://schemas.microsoft.com/office/word/2006/wordml" xmlns:wps="http://schemas.microsoft.com/office/word/2010/wordprocessingShape" mc:Ignorable="w14 w15 w16se w16cid w16 w16cex w16sdtdh w16sdtfl w16du wp14">
+<w:document xmlns:wpc="http://schemas.microsoft.com/office/word/2010/wordprocessingCanvas" xmlns:cx="http://schemas.microsoft.com/office/drawing/2014/chartex" xmlns:cx1="http://schemas.microsoft.com/office/drawing/2015/9/8/chartex" xmlns:cx2="http://schemas.microsoft.com/office/drawing/2015/10/21/chartex" xmlns:cx3="http://schemas.microsoft.com/office/drawing/2016/5/9/chartex" xmlns:cx4="http://schemas.microsoft.com/office/drawing/2016/5/10/chartex" xmlns:cx5="http://schemas.microsoft.com/office/drawing/2016/5/11/chartex" xmlns:cx6="http://schemas.microsoft.com/office/drawing/2016/5/12/chartex" xmlns:cx7="http://schemas.microsoft.com/office/drawing/2016/5/13/chartex" xmlns:cx8="http://schemas.microsoft.com/office/drawing/2016/5/14/chartex" xmlns:mc="http://schemas.openxmlformats.org/markup-compatibility/2006" xmlns:aink="http://schemas.microsoft.com/office/drawing/2016/ink" xmlns:am3d="http://schemas.microsoft.com/office/drawing/2017/model3d" xmlns:o="urn:schemas-microsoft-com:office:office" xmlns:oel="http://schemas.microsoft.com/office/2019/extlst" xmlns:r="http://schemas.openxmlformats.org/officeDocument/2006/relationships" xmlns:m="http://schemas.openxmlformats.org/officeDocument/2006/math" xmlns:v="urn:schemas-microsoft-com:vml" xmlns:wp14="http://schemas.microsoft.com/office/word/2010/wordprocessingDrawing" xmlns:wp="http://schemas.openxmlformats.org/drawingml/2006/wordprocessingDrawing" xmlns:w10="urn:schemas-microsoft-com:office:word" xmlns:w="http://schemas.openxmlformats.org/wordprocessingml/2006/main" xmlns:w14="http://schemas.microsoft.com/office/word/2010/wordml" xmlns:w15="http://schemas.microsoft.com/office/word/2012/wordml" xmlns:w16cex="http://schemas.microsoft.com/office/word/2018/wordml/cex" xmlns:w16cid="http://schemas.microsoft.com/office/word/2016/wordml/cid" xmlns:w16="http://schemas.microsoft.com/office/word/2018/wordml" xmlns:w16sdtdh="http://schemas.microsoft.com/office/word/2020/wordml/sdtdatahash" xmlns:w16se="http://schemas.microsoft.com/office/word/2015/wordml/symex" xmlns:wpg="http://schemas.microsoft.com/office/word/2010/wordprocessingGroup" xmlns:wpi="http://schemas.microsoft.com/office/word/2010/wordprocessingInk" xmlns:wne="http://schemas.microsoft.com/office/word/2006/wordml" xmlns:wps="http://schemas.microsoft.com/office/word/2010/wordprocessingShape" mc:Ignorable="w14 w15 w16se w16cid w16 w16cex w16sdtdh wp14">
   <w:body>
     <w:p>
       <w:pPr>
@@ -9,14 +9,6 @@
           <w:bCs/>
         </w:rPr>
       </w:pPr>
-      <w:r>
-        <w:rPr>
-          <w:rFonts w:ascii="Segoe UI Emoji" w:hAnsi="Segoe UI Emoji" w:cs="Segoe UI Emoji"/>
-          <w:b/>
-          <w:bCs/>
-        </w:rPr>
-        <w:t>🧭</w:t>
-      </w:r>
       <w:r>
         <w:rPr>
           <w:b/>
@@ -53,14 +45,6 @@
       </w:pPr>
       <w:r>
         <w:rPr>
-          <w:rFonts w:ascii="Segoe UI Emoji" w:hAnsi="Segoe UI Emoji" w:cs="Segoe UI Emoji"/>
-          <w:b/>
-          <w:bCs/>
-        </w:rPr>
-        <w:t>📱</w:t>
-      </w:r>
-      <w:r>
-        <w:rPr>
           <w:b/>
           <w:bCs/>
         </w:rPr>
@@ -80,14 +64,6 @@
       </w:pPr>
       <w:r>
         <w:rPr>
-          <w:rFonts w:ascii="Segoe UI Emoji" w:hAnsi="Segoe UI Emoji" w:cs="Segoe UI Emoji"/>
-          <w:b/>
-          <w:bCs/>
-        </w:rPr>
-        <w:t>💻</w:t>
-      </w:r>
-      <w:r>
-        <w:rPr>
           <w:b/>
           <w:bCs/>
         </w:rPr>
@@ -107,14 +83,6 @@
       </w:pPr>
       <w:r>
         <w:rPr>
-          <w:rFonts w:ascii="Segoe UI Emoji" w:hAnsi="Segoe UI Emoji" w:cs="Segoe UI Emoji"/>
-          <w:b/>
-          <w:bCs/>
-        </w:rPr>
-        <w:t>🤖</w:t>
-      </w:r>
-      <w:r>
-        <w:rPr>
           <w:b/>
           <w:bCs/>
         </w:rPr>
@@ -219,14 +187,6 @@
       </w:pPr>
       <w:r>
         <w:rPr>
-          <w:rFonts w:ascii="Segoe UI Emoji" w:hAnsi="Segoe UI Emoji" w:cs="Segoe UI Emoji"/>
-          <w:b/>
-          <w:bCs/>
-        </w:rPr>
-        <w:t>👥</w:t>
-      </w:r>
-      <w:r>
-        <w:rPr>
           <w:b/>
           <w:bCs/>
         </w:rPr>
@@ -351,14 +311,6 @@
       </w:pPr>
       <w:r>
         <w:rPr>
-          <w:rFonts w:ascii="Segoe UI Emoji" w:hAnsi="Segoe UI Emoji" w:cs="Segoe UI Emoji"/>
-          <w:b/>
-          <w:bCs/>
-        </w:rPr>
-        <w:t>⚙️</w:t>
-      </w:r>
-      <w:r>
-        <w:rPr>
           <w:b/>
           <w:bCs/>
         </w:rPr>
@@ -372,14 +324,6 @@
           <w:bCs/>
         </w:rPr>
       </w:pPr>
-      <w:r>
-        <w:rPr>
-          <w:rFonts w:ascii="Segoe UI Emoji" w:hAnsi="Segoe UI Emoji" w:cs="Segoe UI Emoji"/>
-          <w:b/>
-          <w:bCs/>
-        </w:rPr>
-        <w:t>📱</w:t>
-      </w:r>
       <w:r>
         <w:rPr>
           <w:b/>
@@ -522,7 +466,6 @@
           <w:b/>
           <w:bCs/>
         </w:rPr>
-        <w:lastRenderedPageBreak/>
         <w:t>RF03 – Biblioteca de Exercícios</w:t>
       </w:r>
       <w:r>
@@ -550,6 +493,7 @@
           <w:b/>
           <w:bCs/>
         </w:rPr>
+        <w:lastRenderedPageBreak/>
         <w:t xml:space="preserve">Visualização de vídeos explicativos </w:t>
       </w:r>
     </w:p>
@@ -876,14 +820,6 @@
       </w:pPr>
       <w:r>
         <w:rPr>
-          <w:rFonts w:ascii="Segoe UI Emoji" w:hAnsi="Segoe UI Emoji" w:cs="Segoe UI Emoji"/>
-          <w:b/>
-          <w:bCs/>
-        </w:rPr>
-        <w:t>🤖</w:t>
-      </w:r>
-      <w:r>
-        <w:rPr>
           <w:b/>
           <w:bCs/>
         </w:rPr>
@@ -982,7 +918,6 @@
           <w:b/>
           <w:bCs/>
         </w:rPr>
-        <w:lastRenderedPageBreak/>
         <w:t>RF08 – Análise Evolutiva</w:t>
       </w:r>
       <w:r>
@@ -1006,6 +941,7 @@
           <w:b/>
           <w:bCs/>
         </w:rPr>
+        <w:lastRenderedPageBreak/>
         <w:t>RF09 – Recomendação de Treinos</w:t>
       </w:r>
       <w:r>
@@ -1201,29 +1137,6 @@
       </w:pPr>
       <w:r>
         <w:rPr>
-          <w:rFonts w:ascii="Segoe UI Emoji" w:hAnsi="Segoe UI Emoji" w:cs="Segoe UI Emoji"/>
-          <w:b/>
-          <w:bCs/>
-        </w:rPr>
-        <w:t>🧑</w:t>
-      </w:r>
-      <w:r>
-        <w:rPr>
-          <w:b/>
-          <w:bCs/>
-        </w:rPr>
-        <w:t>‍</w:t>
-      </w:r>
-      <w:r>
-        <w:rPr>
-          <w:rFonts w:ascii="Segoe UI Emoji" w:hAnsi="Segoe UI Emoji" w:cs="Segoe UI Emoji"/>
-          <w:b/>
-          <w:bCs/>
-        </w:rPr>
-        <w:t>🏫</w:t>
-      </w:r>
-      <w:r>
-        <w:rPr>
           <w:b/>
           <w:bCs/>
         </w:rPr>
@@ -1452,7 +1365,6 @@
           <w:b/>
           <w:bCs/>
         </w:rPr>
-        <w:lastRenderedPageBreak/>
         <w:t xml:space="preserve">Avaliar execução de exercícios </w:t>
       </w:r>
     </w:p>
@@ -1491,6 +1403,7 @@
           <w:b/>
           <w:bCs/>
         </w:rPr>
+        <w:lastRenderedPageBreak/>
         <w:t>RF18 – Publicação de Conteúdo</w:t>
       </w:r>
       <w:r>
@@ -1549,14 +1462,6 @@
           <w:bCs/>
         </w:rPr>
       </w:pPr>
-      <w:r>
-        <w:rPr>
-          <w:rFonts w:ascii="Segoe UI Emoji" w:hAnsi="Segoe UI Emoji" w:cs="Segoe UI Emoji"/>
-          <w:b/>
-          <w:bCs/>
-        </w:rPr>
-        <w:t>🛠️</w:t>
-      </w:r>
       <w:r>
         <w:rPr>
           <w:b/>
@@ -1776,14 +1681,6 @@
       </w:pPr>
       <w:r>
         <w:rPr>
-          <w:rFonts w:ascii="Segoe UI Emoji" w:hAnsi="Segoe UI Emoji" w:cs="Segoe UI Emoji"/>
-          <w:b/>
-          <w:bCs/>
-        </w:rPr>
-        <w:t>💳</w:t>
-      </w:r>
-      <w:r>
-        <w:rPr>
           <w:b/>
           <w:bCs/>
         </w:rPr>
@@ -1890,7 +1787,6 @@
           <w:b/>
           <w:bCs/>
         </w:rPr>
-        <w:lastRenderedPageBreak/>
         <w:t xml:space="preserve">Treinos ilimitados </w:t>
       </w:r>
     </w:p>
@@ -1944,6 +1840,7 @@
           <w:b/>
           <w:bCs/>
         </w:rPr>
+        <w:lastRenderedPageBreak/>
         <w:t>RF28 – Controle de Plano Premium Plus</w:t>
       </w:r>
       <w:r>
@@ -2038,14 +1935,6 @@
       </w:pPr>
       <w:r>
         <w:rPr>
-          <w:rFonts w:ascii="Segoe UI Emoji" w:hAnsi="Segoe UI Emoji" w:cs="Segoe UI Emoji"/>
-          <w:b/>
-          <w:bCs/>
-        </w:rPr>
-        <w:t>⚙️</w:t>
-      </w:r>
-      <w:r>
-        <w:rPr>
           <w:b/>
           <w:bCs/>
         </w:rPr>
@@ -2059,14 +1948,6 @@
           <w:bCs/>
         </w:rPr>
       </w:pPr>
-      <w:r>
-        <w:rPr>
-          <w:rFonts w:ascii="Segoe UI Emoji" w:hAnsi="Segoe UI Emoji" w:cs="Segoe UI Emoji"/>
-          <w:b/>
-          <w:bCs/>
-        </w:rPr>
-        <w:t>🏗️</w:t>
-      </w:r>
       <w:r>
         <w:rPr>
           <w:b/>
@@ -2344,14 +2225,6 @@
       </w:pPr>
       <w:r>
         <w:rPr>
-          <w:rFonts w:ascii="Segoe UI Emoji" w:hAnsi="Segoe UI Emoji" w:cs="Segoe UI Emoji"/>
-          <w:b/>
-          <w:bCs/>
-        </w:rPr>
-        <w:t>⚡</w:t>
-      </w:r>
-      <w:r>
-        <w:rPr>
           <w:b/>
           <w:bCs/>
         </w:rPr>
@@ -2393,7 +2266,6 @@
           <w:b/>
           <w:bCs/>
         </w:rPr>
-        <w:lastRenderedPageBreak/>
         <w:t>RNF07 – SLA de Feedback</w:t>
       </w:r>
       <w:r>
@@ -2431,17 +2303,10 @@
       </w:pPr>
       <w:r>
         <w:rPr>
-          <w:rFonts w:ascii="Segoe UI Emoji" w:hAnsi="Segoe UI Emoji" w:cs="Segoe UI Emoji"/>
-          <w:b/>
-          <w:bCs/>
-        </w:rPr>
-        <w:t>📱</w:t>
-      </w:r>
-      <w:r>
-        <w:rPr>
-          <w:b/>
-          <w:bCs/>
-        </w:rPr>
+          <w:b/>
+          <w:bCs/>
+        </w:rPr>
+        <w:lastRenderedPageBreak/>
         <w:t xml:space="preserve"> Usabilidade</w:t>
       </w:r>
     </w:p>
@@ -2517,18 +2382,10 @@
       </w:pPr>
       <w:r>
         <w:rPr>
-          <w:rFonts w:ascii="Segoe UI Emoji" w:hAnsi="Segoe UI Emoji" w:cs="Segoe UI Emoji"/>
-          <w:b/>
-          <w:bCs/>
-        </w:rPr>
-        <w:t>🔐</w:t>
-      </w:r>
-      <w:r>
-        <w:rPr>
-          <w:b/>
-          <w:bCs/>
-        </w:rPr>
-        <w:t xml:space="preserve"> Segurança</w:t>
+          <w:b/>
+          <w:bCs/>
+        </w:rPr>
+        <w:t>Segurança</w:t>
       </w:r>
     </w:p>
     <w:p>
@@ -2601,14 +2458,6 @@
           <w:bCs/>
         </w:rPr>
       </w:pPr>
-      <w:r>
-        <w:rPr>
-          <w:rFonts w:ascii="Segoe UI Emoji" w:hAnsi="Segoe UI Emoji" w:cs="Segoe UI Emoji"/>
-          <w:b/>
-          <w:bCs/>
-        </w:rPr>
-        <w:t>🚀</w:t>
-      </w:r>
       <w:r>
         <w:rPr>
           <w:b/>
@@ -2820,7 +2669,7 @@
 </file>
 
 <file path=word/numbering.xml><?xml version="1.0" encoding="utf-8"?>
-<w:numbering xmlns:wpc="http://schemas.microsoft.com/office/word/2010/wordprocessingCanvas" xmlns:cx="http://schemas.microsoft.com/office/drawing/2014/chartex" xmlns:cx1="http://schemas.microsoft.com/office/drawing/2015/9/8/chartex" xmlns:cx2="http://schemas.microsoft.com/office/drawing/2015/10/21/chartex" xmlns:cx3="http://schemas.microsoft.com/office/drawing/2016/5/9/chartex" xmlns:cx4="http://schemas.microsoft.com/office/drawing/2016/5/10/chartex" xmlns:cx5="http://schemas.microsoft.com/office/drawing/2016/5/11/chartex" xmlns:cx6="http://schemas.microsoft.com/office/drawing/2016/5/12/chartex" xmlns:cx7="http://schemas.microsoft.com/office/drawing/2016/5/13/chartex" xmlns:cx8="http://schemas.microsoft.com/office/drawing/2016/5/14/chartex" xmlns:mc="http://schemas.openxmlformats.org/markup-compatibility/2006" xmlns:aink="http://schemas.microsoft.com/office/drawing/2016/ink" xmlns:am3d="http://schemas.microsoft.com/office/drawing/2017/model3d" xmlns:o="urn:schemas-microsoft-com:office:office" xmlns:oel="http://schemas.microsoft.com/office/2019/extlst" xmlns:r="http://schemas.openxmlformats.org/officeDocument/2006/relationships" xmlns:m="http://schemas.openxmlformats.org/officeDocument/2006/math" xmlns:v="urn:schemas-microsoft-com:vml" xmlns:wp14="http://schemas.microsoft.com/office/word/2010/wordprocessingDrawing" xmlns:wp="http://schemas.openxmlformats.org/drawingml/2006/wordprocessingDrawing" xmlns:w10="urn:schemas-microsoft-com:office:word" xmlns:w="http://schemas.openxmlformats.org/wordprocessingml/2006/main" xmlns:w14="http://schemas.microsoft.com/office/word/2010/wordml" xmlns:w15="http://schemas.microsoft.com/office/word/2012/wordml" xmlns:w16cex="http://schemas.microsoft.com/office/word/2018/wordml/cex" xmlns:w16cid="http://schemas.microsoft.com/office/word/2016/wordml/cid" xmlns:w16="http://schemas.microsoft.com/office/word/2018/wordml" xmlns:w16du="http://schemas.microsoft.com/office/word/2023/wordml/word16du" xmlns:w16sdtdh="http://schemas.microsoft.com/office/word/2020/wordml/sdtdatahash" xmlns:w16sdtfl="http://schemas.microsoft.com/office/word/2024/wordml/sdtformatlock" xmlns:w16se="http://schemas.microsoft.com/office/word/2015/wordml/symex" xmlns:wpg="http://schemas.microsoft.com/office/word/2010/wordprocessingGroup" xmlns:wpi="http://schemas.microsoft.com/office/word/2010/wordprocessingInk" xmlns:wne="http://schemas.microsoft.com/office/word/2006/wordml" xmlns:wps="http://schemas.microsoft.com/office/word/2010/wordprocessingShape" mc:Ignorable="w14 w15 w16se w16cid w16 w16cex w16sdtdh w16sdtfl w16du wp14">
+<w:numbering xmlns:wpc="http://schemas.microsoft.com/office/word/2010/wordprocessingCanvas" xmlns:cx="http://schemas.microsoft.com/office/drawing/2014/chartex" xmlns:cx1="http://schemas.microsoft.com/office/drawing/2015/9/8/chartex" xmlns:cx2="http://schemas.microsoft.com/office/drawing/2015/10/21/chartex" xmlns:cx3="http://schemas.microsoft.com/office/drawing/2016/5/9/chartex" xmlns:cx4="http://schemas.microsoft.com/office/drawing/2016/5/10/chartex" xmlns:cx5="http://schemas.microsoft.com/office/drawing/2016/5/11/chartex" xmlns:cx6="http://schemas.microsoft.com/office/drawing/2016/5/12/chartex" xmlns:cx7="http://schemas.microsoft.com/office/drawing/2016/5/13/chartex" xmlns:cx8="http://schemas.microsoft.com/office/drawing/2016/5/14/chartex" xmlns:mc="http://schemas.openxmlformats.org/markup-compatibility/2006" xmlns:aink="http://schemas.microsoft.com/office/drawing/2016/ink" xmlns:am3d="http://schemas.microsoft.com/office/drawing/2017/model3d" xmlns:o="urn:schemas-microsoft-com:office:office" xmlns:oel="http://schemas.microsoft.com/office/2019/extlst" xmlns:r="http://schemas.openxmlformats.org/officeDocument/2006/relationships" xmlns:m="http://schemas.openxmlformats.org/officeDocument/2006/math" xmlns:v="urn:schemas-microsoft-com:vml" xmlns:wp14="http://schemas.microsoft.com/office/word/2010/wordprocessingDrawing" xmlns:wp="http://schemas.openxmlformats.org/drawingml/2006/wordprocessingDrawing" xmlns:w10="urn:schemas-microsoft-com:office:word" xmlns:w="http://schemas.openxmlformats.org/wordprocessingml/2006/main" xmlns:w14="http://schemas.microsoft.com/office/word/2010/wordml" xmlns:w15="http://schemas.microsoft.com/office/word/2012/wordml" xmlns:w16cex="http://schemas.microsoft.com/office/word/2018/wordml/cex" xmlns:w16cid="http://schemas.microsoft.com/office/word/2016/wordml/cid" xmlns:w16="http://schemas.microsoft.com/office/word/2018/wordml" xmlns:w16sdtdh="http://schemas.microsoft.com/office/word/2020/wordml/sdtdatahash" xmlns:w16se="http://schemas.microsoft.com/office/word/2015/wordml/symex" xmlns:wpg="http://schemas.microsoft.com/office/word/2010/wordprocessingGroup" xmlns:wpi="http://schemas.microsoft.com/office/word/2010/wordprocessingInk" xmlns:wne="http://schemas.microsoft.com/office/word/2006/wordml" xmlns:wps="http://schemas.microsoft.com/office/word/2010/wordprocessingShape" mc:Ignorable="w14 w15 w16se w16cid w16 w16cex w16sdtdh wp14">
   <w:abstractNum w:abstractNumId="0" w15:restartNumberingAfterBreak="0">
     <w:nsid w:val="07F56E72"/>
     <w:multiLevelType w:val="multilevel"/>
@@ -6498,7 +6347,7 @@
 </file>
 
 <file path=word/styles.xml><?xml version="1.0" encoding="utf-8"?>
-<w:styles xmlns:mc="http://schemas.openxmlformats.org/markup-compatibility/2006" xmlns:r="http://schemas.openxmlformats.org/officeDocument/2006/relationships" xmlns:w="http://schemas.openxmlformats.org/wordprocessingml/2006/main" xmlns:w14="http://schemas.microsoft.com/office/word/2010/wordml" xmlns:w15="http://schemas.microsoft.com/office/word/2012/wordml" xmlns:w16cex="http://schemas.microsoft.com/office/word/2018/wordml/cex" xmlns:w16cid="http://schemas.microsoft.com/office/word/2016/wordml/cid" xmlns:w16="http://schemas.microsoft.com/office/word/2018/wordml" xmlns:w16du="http://schemas.microsoft.com/office/word/2023/wordml/word16du" xmlns:w16sdtdh="http://schemas.microsoft.com/office/word/2020/wordml/sdtdatahash" xmlns:w16sdtfl="http://schemas.microsoft.com/office/word/2024/wordml/sdtformatlock" xmlns:w16se="http://schemas.microsoft.com/office/word/2015/wordml/symex" mc:Ignorable="w14 w15 w16se w16cid w16 w16cex w16sdtdh w16sdtfl w16du">
+<w:styles xmlns:mc="http://schemas.openxmlformats.org/markup-compatibility/2006" xmlns:r="http://schemas.openxmlformats.org/officeDocument/2006/relationships" xmlns:w="http://schemas.openxmlformats.org/wordprocessingml/2006/main" xmlns:w14="http://schemas.microsoft.com/office/word/2010/wordml" xmlns:w15="http://schemas.microsoft.com/office/word/2012/wordml" xmlns:w16cex="http://schemas.microsoft.com/office/word/2018/wordml/cex" xmlns:w16cid="http://schemas.microsoft.com/office/word/2016/wordml/cid" xmlns:w16="http://schemas.microsoft.com/office/word/2018/wordml" xmlns:w16sdtdh="http://schemas.microsoft.com/office/word/2020/wordml/sdtdatahash" xmlns:w16se="http://schemas.microsoft.com/office/word/2015/wordml/symex" mc:Ignorable="w14 w15 w16se w16cid w16 w16cex w16sdtdh">
   <w:docDefaults>
     <w:rPrDefault>
       <w:rPr>
@@ -7100,6 +6949,7 @@
   <w:style w:type="character" w:default="1" w:styleId="Fontepargpadro">
     <w:name w:val="Default Paragraph Font"/>
     <w:uiPriority w:val="1"/>
+    <w:semiHidden/>
     <w:unhideWhenUsed/>
   </w:style>
   <w:style w:type="table" w:default="1" w:styleId="Tabelanormal">

</xml_diff>